<commit_message>
V2 se agrega convertir a pdf
</commit_message>
<xml_diff>
--- a/Carta Tratamiento dental Reconocer.docx
+++ b/Carta Tratamiento dental Reconocer.docx
@@ -2720,10 +2720,19 @@
                       <w:rFonts w:ascii="Calibri" w:eastAsia="Calibri" w:hAnsi="Calibri" w:cs="Calibri"/>
                       <w:color w:val="000000"/>
                     </w:rPr>
+                    <w:t xml:space="preserve">a un costo de </w:t>
+                  </w:r>
+                  <w:proofErr w:type="spellStart"/>
+                  <w:r>
+                    <w:rPr>
+                      <w:rFonts w:ascii="Calibri" w:eastAsia="Calibri" w:hAnsi="Calibri" w:cs="Calibri"/>
+                      <w:color w:val="000000"/>
+                    </w:rPr>
                     <w:t>PrecioTemplate</w:t>
                   </w:r>
                   <w:bookmarkStart w:id="0" w:name="_GoBack"/>
                   <w:bookmarkEnd w:id="0"/>
+                  <w:proofErr w:type="spellEnd"/>
                 </w:p>
                 <w:p>
                   <w:pPr>

</xml_diff>